<commit_message>
Created an app.py file for the UI code
</commit_message>
<xml_diff>
--- a/data/sample.docx
+++ b/data/sample.docx
@@ -3,18 +3,197 @@
 <w:document xmlns:wpc="http://schemas.microsoft.com/office/word/2010/wordprocessingCanvas" xmlns:mo="http://schemas.microsoft.com/office/mac/office/2008/main" xmlns:mc="http://schemas.openxmlformats.org/markup-compatibility/2006" xmlns:mv="urn:schemas-microsoft-com:mac:vml" xmlns:o="urn:schemas-microsoft-com:office:office" xmlns:r="http://schemas.openxmlformats.org/officeDocument/2006/relationships" xmlns:m="http://schemas.openxmlformats.org/officeDocument/2006/math" xmlns:v="urn:schemas-microsoft-com:vml" xmlns:wp14="http://schemas.microsoft.com/office/word/2010/wordprocessingDrawing" xmlns:wp="http://schemas.openxmlformats.org/drawingml/2006/wordprocessingDrawing" xmlns:w10="urn:schemas-microsoft-com:office:word" xmlns:w="http://schemas.openxmlformats.org/wordprocessingml/2006/main" xmlns:w14="http://schemas.microsoft.com/office/word/2010/wordml" xmlns:wpg="http://schemas.microsoft.com/office/word/2010/wordprocessingGroup" xmlns:wpi="http://schemas.microsoft.com/office/word/2010/wordprocessingInk" xmlns:wne="http://schemas.microsoft.com/office/word/2006/wordml" xmlns:wps="http://schemas.microsoft.com/office/word/2010/wordprocessingShape" mc:Ignorable="w14 wp14">
   <w:body>
     <w:p>
+      <w:pPr>
+        <w:pStyle w:val="Title"/>
+      </w:pPr>
       <w:r>
-        <w:t>The API (Application Programming Interface) allows communication between systems.</w:t>
+        <w:t>System Documentation</w:t>
       </w:r>
     </w:p>
     <w:p>
       <w:r>
-        <w:t>This document follows ICT standards for all LLM based tools.</w:t>
+        <w:t>This document describes the API integration for the ICT platform.</w:t>
       </w:r>
     </w:p>
     <w:p>
       <w:r>
-        <w:t>The UI must be approved by the QA team before release.</w:t>
+        <w:t>The LLM model is used to process requests from the UI.</w:t>
+      </w:r>
+    </w:p>
+    <w:p>
+      <w:r>
+        <w:t>All requests are validated by the QA team before release.</w:t>
+      </w:r>
+    </w:p>
+    <w:p>
+      <w:pPr>
+        <w:pStyle w:val="Heading1"/>
+      </w:pPr>
+      <w:r>
+        <w:t>Login Page</w:t>
+      </w:r>
+    </w:p>
+    <w:p>
+      <w:r>
+        <w:t>The following screenshot shows the login interface of the system.</w:t>
+      </w:r>
+    </w:p>
+    <w:p>
+      <w:r>
+        <w:rPr>
+          <w:b/>
+          <w:i/>
+        </w:rPr>
+        <w:t>[SCREENSHOT: Login page of the application]</w:t>
+      </w:r>
+    </w:p>
+    <w:p>
+      <w:r>
+        <w:t>Users must enter their credentials to access the system.</w:t>
+      </w:r>
+    </w:p>
+    <w:p>
+      <w:pPr>
+        <w:pStyle w:val="Heading1"/>
+      </w:pPr>
+      <w:r>
+        <w:t>API Response Codes</w:t>
+      </w:r>
+    </w:p>
+    <w:p>
+      <w:r>
+        <w:t>The following table shows the standard API response codes.</w:t>
+      </w:r>
+    </w:p>
+    <w:tbl>
+      <w:tblPr>
+        <w:tblStyle w:val="TableGrid"/>
+        <w:tblW w:type="auto" w:w="0"/>
+        <w:tblLook w:firstColumn="1" w:firstRow="1" w:lastColumn="0" w:lastRow="0" w:noHBand="0" w:noVBand="1" w:val="04A0"/>
+      </w:tblPr>
+      <w:tblGrid>
+        <w:gridCol w:w="4320"/>
+        <w:gridCol w:w="4320"/>
+      </w:tblGrid>
+      <w:tr>
+        <w:tc>
+          <w:tcPr>
+            <w:tcW w:type="dxa" w:w="4320"/>
+          </w:tcPr>
+          <w:p>
+            <w:r>
+              <w:t>Response Code</w:t>
+            </w:r>
+          </w:p>
+        </w:tc>
+        <w:tc>
+          <w:tcPr>
+            <w:tcW w:type="dxa" w:w="4320"/>
+          </w:tcPr>
+          <w:p>
+            <w:r>
+              <w:t>Meaning</w:t>
+            </w:r>
+          </w:p>
+        </w:tc>
+      </w:tr>
+      <w:tr>
+        <w:tc>
+          <w:tcPr>
+            <w:tcW w:type="dxa" w:w="4320"/>
+          </w:tcPr>
+          <w:p>
+            <w:r>
+              <w:t>200</w:t>
+            </w:r>
+          </w:p>
+        </w:tc>
+        <w:tc>
+          <w:tcPr>
+            <w:tcW w:type="dxa" w:w="4320"/>
+          </w:tcPr>
+          <w:p>
+            <w:r>
+              <w:t>Success</w:t>
+            </w:r>
+          </w:p>
+        </w:tc>
+      </w:tr>
+      <w:tr>
+        <w:tc>
+          <w:tcPr>
+            <w:tcW w:type="dxa" w:w="4320"/>
+          </w:tcPr>
+          <w:p>
+            <w:r>
+              <w:t>404</w:t>
+            </w:r>
+          </w:p>
+        </w:tc>
+        <w:tc>
+          <w:tcPr>
+            <w:tcW w:type="dxa" w:w="4320"/>
+          </w:tcPr>
+          <w:p>
+            <w:r>
+              <w:t>Not Found</w:t>
+            </w:r>
+          </w:p>
+        </w:tc>
+      </w:tr>
+      <w:tr>
+        <w:tc>
+          <w:tcPr>
+            <w:tcW w:type="dxa" w:w="4320"/>
+          </w:tcPr>
+          <w:p>
+            <w:r>
+              <w:t>500</w:t>
+            </w:r>
+          </w:p>
+        </w:tc>
+        <w:tc>
+          <w:tcPr>
+            <w:tcW w:type="dxa" w:w="4320"/>
+          </w:tcPr>
+          <w:p>
+            <w:r>
+              <w:t>Internal Server Error</w:t>
+            </w:r>
+          </w:p>
+        </w:tc>
+      </w:tr>
+    </w:tbl>
+    <w:p>
+      <w:r>
+        <w:t>These codes are returned by the API in all responses.</w:t>
+      </w:r>
+    </w:p>
+    <w:p>
+      <w:pPr>
+        <w:pStyle w:val="Heading1"/>
+      </w:pPr>
+      <w:r>
+        <w:t>Dashboard Overview</w:t>
+      </w:r>
+    </w:p>
+    <w:p>
+      <w:r>
+        <w:t>The screenshot below shows the main dashboard of the system.</w:t>
+      </w:r>
+    </w:p>
+    <w:p>
+      <w:r>
+        <w:rPr>
+          <w:b/>
+          <w:i/>
+        </w:rPr>
+        <w:t>[SCREENSHOT: Main dashboard with analytics charts]</w:t>
+      </w:r>
+    </w:p>
+    <w:p>
+      <w:r>
+        <w:t>The dashboard displays all QA metrics and LLM usage statistics.</w:t>
       </w:r>
     </w:p>
     <w:sectPr>

</xml_diff>